<commit_message>
docs: ZP-DOC-04 catalogue kept consistent with SRS (FR-113, FR-308); CLAUDE.md: Praveen's decisions (stack approved, parallel implementation)
Co-Authored-By: Claude Opus 5.5 (1M context) <noreply@anthropic.com>
</commit_message>
<xml_diff>
--- a/docs/04-use-cases/ZP-DOC-04_Use-Case-Model.docx
+++ b/docs/04-use-cases/ZP-DOC-04_Use-Case-Model.docx
@@ -1444,6 +1444,122 @@
           </w:p>
         </w:tc>
       </w:tr>
+      <w:tr>
+        <w:tblPrEx>
+          <w:tblCellMar>
+            <w:top w:w="0" w:type="dxa"/>
+            <w:bottom w:w="0" w:type="dxa"/>
+          </w:tblCellMar>
+        </w:tblPrEx>
+        <w:trPr>
+          <w:cantSplit/>
+          <w:trHeight w:val="420"/>
+        </w:trPr>
+        <w:tc>
+          <w:tcPr>
+            <w:tcW w:w="964" w:type="dxa"/>
+            <w:tcBorders>
+              <w:top w:val="single" w:sz="4" w:space="0" w:color="C9D3D0"/>
+              <w:left w:val="single" w:sz="4" w:space="0" w:color="C9D3D0"/>
+              <w:bottom w:val="single" w:sz="4" w:space="0" w:color="C9D3D0"/>
+              <w:right w:val="single" w:sz="4" w:space="0" w:color="C9D3D0"/>
+            </w:tcBorders>
+            <w:tcMar>
+              <w:top w:w="50" w:type="dxa"/>
+              <w:left w:w="100" w:type="dxa"/>
+              <w:bottom w:w="50" w:type="dxa"/>
+              <w:right w:w="100" w:type="dxa"/>
+            </w:tcMar>
+          </w:tcPr>
+          <w:p>
+            <w:r>
+              <w:rPr>
+                <w:sz w:val="19"/>
+                <w:szCs w:val="19"/>
+              </w:rPr>
+              <w:t>0.9</w:t>
+            </w:r>
+          </w:p>
+        </w:tc>
+        <w:tc>
+          <w:tcPr>
+            <w:tcW w:w="1542" w:type="dxa"/>
+            <w:tcBorders>
+              <w:top w:val="single" w:sz="4" w:space="0" w:color="C9D3D0"/>
+              <w:left w:val="single" w:sz="4" w:space="0" w:color="C9D3D0"/>
+              <w:bottom w:val="single" w:sz="4" w:space="0" w:color="C9D3D0"/>
+              <w:right w:val="single" w:sz="4" w:space="0" w:color="C9D3D0"/>
+            </w:tcBorders>
+            <w:tcMar>
+              <w:top w:w="50" w:type="dxa"/>
+              <w:left w:w="100" w:type="dxa"/>
+              <w:bottom w:w="50" w:type="dxa"/>
+              <w:right w:w="100" w:type="dxa"/>
+            </w:tcMar>
+          </w:tcPr>
+          <w:p>
+            <w:r>
+              <w:rPr>
+                <w:sz w:val="19"/>
+                <w:szCs w:val="19"/>
+              </w:rPr>
+              <w:t>5 Oct 2026</w:t>
+            </w:r>
+          </w:p>
+        </w:tc>
+        <w:tc>
+          <w:tcPr>
+            <w:tcW w:w="1928" w:type="dxa"/>
+            <w:tcBorders>
+              <w:top w:val="single" w:sz="4" w:space="0" w:color="C9D3D0"/>
+              <w:left w:val="single" w:sz="4" w:space="0" w:color="C9D3D0"/>
+              <w:bottom w:val="single" w:sz="4" w:space="0" w:color="C9D3D0"/>
+              <w:right w:val="single" w:sz="4" w:space="0" w:color="C9D3D0"/>
+            </w:tcBorders>
+            <w:tcMar>
+              <w:top w:w="50" w:type="dxa"/>
+              <w:left w:w="100" w:type="dxa"/>
+              <w:bottom w:w="50" w:type="dxa"/>
+              <w:right w:w="100" w:type="dxa"/>
+            </w:tcMar>
+          </w:tcPr>
+          <w:p>
+            <w:r>
+              <w:rPr>
+                <w:sz w:val="19"/>
+                <w:szCs w:val="19"/>
+              </w:rPr>
+              <w:t>Team Kestrel</w:t>
+            </w:r>
+          </w:p>
+        </w:tc>
+        <w:tc>
+          <w:tcPr>
+            <w:tcW w:w="5204" w:type="dxa"/>
+            <w:tcBorders>
+              <w:top w:val="single" w:sz="4" w:space="0" w:color="C9D3D0"/>
+              <w:left w:val="single" w:sz="4" w:space="0" w:color="C9D3D0"/>
+              <w:bottom w:val="single" w:sz="4" w:space="0" w:color="C9D3D0"/>
+              <w:right w:val="single" w:sz="4" w:space="0" w:color="C9D3D0"/>
+            </w:tcBorders>
+            <w:tcMar>
+              <w:top w:w="50" w:type="dxa"/>
+              <w:left w:w="100" w:type="dxa"/>
+              <w:bottom w:w="50" w:type="dxa"/>
+              <w:right w:w="100" w:type="dxa"/>
+            </w:tcMar>
+          </w:tcPr>
+          <w:p>
+            <w:r>
+              <w:rPr>
+                <w:sz w:val="19"/>
+                <w:szCs w:val="19"/>
+              </w:rPr>
+              <w:t>Review update: catalogue extended for FR-113 (O/L requirements) and FR-308 (list limit) added to ZP-DOC-03</w:t>
+            </w:r>
+          </w:p>
+        </w:tc>
+      </w:tr>
     </w:tbl>
     <w:p>
       <w:pPr>
@@ -1843,7 +1959,7 @@
     <w:sdt>
       <w:sdtPr>
         <w:alias w:val="Contents"/>
-        <w:id w:val="-101569642"/>
+        <w:id w:val="1024052276"/>
       </w:sdtPr>
       <w:sdtEndPr/>
       <w:sdtContent>
@@ -1872,7 +1988,7 @@
           <w:r>
             <w:fldChar w:fldCharType="separate"/>
           </w:r>
-          <w:hyperlink w:anchor="_Toc242095978" w:history="1">
+          <w:hyperlink w:anchor="_Toc242096882" w:history="1">
             <w:r>
               <w:rPr>
                 <w:rStyle w:val="Hyperlink"/>
@@ -1896,7 +2012,7 @@
               <w:rPr>
                 <w:noProof/>
               </w:rPr>
-              <w:instrText xml:space="preserve"> PAGEREF _Toc242095978 \h </w:instrText>
+              <w:instrText xml:space="preserve"> PAGEREF _Toc242096882 \h </w:instrText>
             </w:r>
             <w:r>
               <w:rPr>
@@ -1939,7 +2055,7 @@
               <w14:ligatures w14:val="standardContextual"/>
             </w:rPr>
           </w:pPr>
-          <w:hyperlink w:anchor="_Toc242095979" w:history="1">
+          <w:hyperlink w:anchor="_Toc242096883" w:history="1">
             <w:r>
               <w:rPr>
                 <w:rStyle w:val="Hyperlink"/>
@@ -1963,7 +2079,7 @@
               <w:rPr>
                 <w:noProof/>
               </w:rPr>
-              <w:instrText xml:space="preserve"> PAGEREF _Toc242095979 \h </w:instrText>
+              <w:instrText xml:space="preserve"> PAGEREF _Toc242096883 \h </w:instrText>
             </w:r>
             <w:r>
               <w:rPr>
@@ -2006,7 +2122,7 @@
               <w14:ligatures w14:val="standardContextual"/>
             </w:rPr>
           </w:pPr>
-          <w:hyperlink w:anchor="_Toc242095980" w:history="1">
+          <w:hyperlink w:anchor="_Toc242096884" w:history="1">
             <w:r>
               <w:rPr>
                 <w:rStyle w:val="Hyperlink"/>
@@ -2030,7 +2146,7 @@
               <w:rPr>
                 <w:noProof/>
               </w:rPr>
-              <w:instrText xml:space="preserve"> PAGEREF _Toc242095980 \h </w:instrText>
+              <w:instrText xml:space="preserve"> PAGEREF _Toc242096884 \h </w:instrText>
             </w:r>
             <w:r>
               <w:rPr>
@@ -2073,7 +2189,7 @@
               <w14:ligatures w14:val="standardContextual"/>
             </w:rPr>
           </w:pPr>
-          <w:hyperlink w:anchor="_Toc242095981" w:history="1">
+          <w:hyperlink w:anchor="_Toc242096885" w:history="1">
             <w:r>
               <w:rPr>
                 <w:rStyle w:val="Hyperlink"/>
@@ -2097,7 +2213,7 @@
               <w:rPr>
                 <w:noProof/>
               </w:rPr>
-              <w:instrText xml:space="preserve"> PAGEREF _Toc242095981 \h </w:instrText>
+              <w:instrText xml:space="preserve"> PAGEREF _Toc242096885 \h </w:instrText>
             </w:r>
             <w:r>
               <w:rPr>
@@ -2140,7 +2256,7 @@
               <w14:ligatures w14:val="standardContextual"/>
             </w:rPr>
           </w:pPr>
-          <w:hyperlink w:anchor="_Toc242095982" w:history="1">
+          <w:hyperlink w:anchor="_Toc242096886" w:history="1">
             <w:r>
               <w:rPr>
                 <w:rStyle w:val="Hyperlink"/>
@@ -2164,7 +2280,7 @@
               <w:rPr>
                 <w:noProof/>
               </w:rPr>
-              <w:instrText xml:space="preserve"> PAGEREF _Toc242095982 \h </w:instrText>
+              <w:instrText xml:space="preserve"> PAGEREF _Toc242096886 \h </w:instrText>
             </w:r>
             <w:r>
               <w:rPr>
@@ -2207,7 +2323,7 @@
               <w14:ligatures w14:val="standardContextual"/>
             </w:rPr>
           </w:pPr>
-          <w:hyperlink w:anchor="_Toc242095983" w:history="1">
+          <w:hyperlink w:anchor="_Toc242096887" w:history="1">
             <w:r>
               <w:rPr>
                 <w:rStyle w:val="Hyperlink"/>
@@ -2231,7 +2347,7 @@
               <w:rPr>
                 <w:noProof/>
               </w:rPr>
-              <w:instrText xml:space="preserve"> PAGEREF _Toc242095983 \h </w:instrText>
+              <w:instrText xml:space="preserve"> PAGEREF _Toc242096887 \h </w:instrText>
             </w:r>
             <w:r>
               <w:rPr>
@@ -2274,7 +2390,7 @@
               <w14:ligatures w14:val="standardContextual"/>
             </w:rPr>
           </w:pPr>
-          <w:hyperlink w:anchor="_Toc242095984" w:history="1">
+          <w:hyperlink w:anchor="_Toc242096888" w:history="1">
             <w:r>
               <w:rPr>
                 <w:rStyle w:val="Hyperlink"/>
@@ -2298,7 +2414,7 @@
               <w:rPr>
                 <w:noProof/>
               </w:rPr>
-              <w:instrText xml:space="preserve"> PAGEREF _Toc242095984 \h </w:instrText>
+              <w:instrText xml:space="preserve"> PAGEREF _Toc242096888 \h </w:instrText>
             </w:r>
             <w:r>
               <w:rPr>
@@ -2341,7 +2457,7 @@
               <w14:ligatures w14:val="standardContextual"/>
             </w:rPr>
           </w:pPr>
-          <w:hyperlink w:anchor="_Toc242095985" w:history="1">
+          <w:hyperlink w:anchor="_Toc242096889" w:history="1">
             <w:r>
               <w:rPr>
                 <w:rStyle w:val="Hyperlink"/>
@@ -2365,7 +2481,7 @@
               <w:rPr>
                 <w:noProof/>
               </w:rPr>
-              <w:instrText xml:space="preserve"> PAGEREF _Toc242095985 \h </w:instrText>
+              <w:instrText xml:space="preserve"> PAGEREF _Toc242096889 \h </w:instrText>
             </w:r>
             <w:r>
               <w:rPr>
@@ -2408,7 +2524,7 @@
               <w14:ligatures w14:val="standardContextual"/>
             </w:rPr>
           </w:pPr>
-          <w:hyperlink w:anchor="_Toc242095986" w:history="1">
+          <w:hyperlink w:anchor="_Toc242096890" w:history="1">
             <w:r>
               <w:rPr>
                 <w:rStyle w:val="Hyperlink"/>
@@ -2432,7 +2548,7 @@
               <w:rPr>
                 <w:noProof/>
               </w:rPr>
-              <w:instrText xml:space="preserve"> PAGEREF _Toc242095986 \h </w:instrText>
+              <w:instrText xml:space="preserve"> PAGEREF _Toc242096890 \h </w:instrText>
             </w:r>
             <w:r>
               <w:rPr>
@@ -2475,7 +2591,7 @@
               <w14:ligatures w14:val="standardContextual"/>
             </w:rPr>
           </w:pPr>
-          <w:hyperlink w:anchor="_Toc242095987" w:history="1">
+          <w:hyperlink w:anchor="_Toc242096891" w:history="1">
             <w:r>
               <w:rPr>
                 <w:rStyle w:val="Hyperlink"/>
@@ -2499,7 +2615,7 @@
               <w:rPr>
                 <w:noProof/>
               </w:rPr>
-              <w:instrText xml:space="preserve"> PAGEREF _Toc242095987 \h </w:instrText>
+              <w:instrText xml:space="preserve"> PAGEREF _Toc242096891 \h </w:instrText>
             </w:r>
             <w:r>
               <w:rPr>
@@ -2542,7 +2658,7 @@
               <w14:ligatures w14:val="standardContextual"/>
             </w:rPr>
           </w:pPr>
-          <w:hyperlink w:anchor="_Toc242095988" w:history="1">
+          <w:hyperlink w:anchor="_Toc242096892" w:history="1">
             <w:r>
               <w:rPr>
                 <w:rStyle w:val="Hyperlink"/>
@@ -2566,7 +2682,7 @@
               <w:rPr>
                 <w:noProof/>
               </w:rPr>
-              <w:instrText xml:space="preserve"> PAGEREF _Toc242095988 \h </w:instrText>
+              <w:instrText xml:space="preserve"> PAGEREF _Toc242096892 \h </w:instrText>
             </w:r>
             <w:r>
               <w:rPr>
@@ -2609,7 +2725,7 @@
               <w14:ligatures w14:val="standardContextual"/>
             </w:rPr>
           </w:pPr>
-          <w:hyperlink w:anchor="_Toc242095989" w:history="1">
+          <w:hyperlink w:anchor="_Toc242096893" w:history="1">
             <w:r>
               <w:rPr>
                 <w:rStyle w:val="Hyperlink"/>
@@ -2633,7 +2749,7 @@
               <w:rPr>
                 <w:noProof/>
               </w:rPr>
-              <w:instrText xml:space="preserve"> PAGEREF _Toc242095989 \h </w:instrText>
+              <w:instrText xml:space="preserve"> PAGEREF _Toc242096893 \h </w:instrText>
             </w:r>
             <w:r>
               <w:rPr>
@@ -2676,7 +2792,7 @@
               <w14:ligatures w14:val="standardContextual"/>
             </w:rPr>
           </w:pPr>
-          <w:hyperlink w:anchor="_Toc242095990" w:history="1">
+          <w:hyperlink w:anchor="_Toc242096894" w:history="1">
             <w:r>
               <w:rPr>
                 <w:rStyle w:val="Hyperlink"/>
@@ -2700,7 +2816,7 @@
               <w:rPr>
                 <w:noProof/>
               </w:rPr>
-              <w:instrText xml:space="preserve"> PAGEREF _Toc242095990 \h </w:instrText>
+              <w:instrText xml:space="preserve"> PAGEREF _Toc242096894 \h </w:instrText>
             </w:r>
             <w:r>
               <w:rPr>
@@ -2743,7 +2859,7 @@
               <w14:ligatures w14:val="standardContextual"/>
             </w:rPr>
           </w:pPr>
-          <w:hyperlink w:anchor="_Toc242095991" w:history="1">
+          <w:hyperlink w:anchor="_Toc242096895" w:history="1">
             <w:r>
               <w:rPr>
                 <w:rStyle w:val="Hyperlink"/>
@@ -2767,7 +2883,7 @@
               <w:rPr>
                 <w:noProof/>
               </w:rPr>
-              <w:instrText xml:space="preserve"> PAGEREF _Toc242095991 \h </w:instrText>
+              <w:instrText xml:space="preserve"> PAGEREF _Toc242096895 \h </w:instrText>
             </w:r>
             <w:r>
               <w:rPr>
@@ -2810,7 +2926,7 @@
               <w14:ligatures w14:val="standardContextual"/>
             </w:rPr>
           </w:pPr>
-          <w:hyperlink w:anchor="_Toc242095992" w:history="1">
+          <w:hyperlink w:anchor="_Toc242096896" w:history="1">
             <w:r>
               <w:rPr>
                 <w:rStyle w:val="Hyperlink"/>
@@ -2834,7 +2950,7 @@
               <w:rPr>
                 <w:noProof/>
               </w:rPr>
-              <w:instrText xml:space="preserve"> PAGEREF _Toc242095992 \h </w:instrText>
+              <w:instrText xml:space="preserve"> PAGEREF _Toc242096896 \h </w:instrText>
             </w:r>
             <w:r>
               <w:rPr>
@@ -2877,7 +2993,7 @@
               <w14:ligatures w14:val="standardContextual"/>
             </w:rPr>
           </w:pPr>
-          <w:hyperlink w:anchor="_Toc242095993" w:history="1">
+          <w:hyperlink w:anchor="_Toc242096897" w:history="1">
             <w:r>
               <w:rPr>
                 <w:rStyle w:val="Hyperlink"/>
@@ -2901,7 +3017,7 @@
               <w:rPr>
                 <w:noProof/>
               </w:rPr>
-              <w:instrText xml:space="preserve"> PAGEREF _Toc242095993 \h </w:instrText>
+              <w:instrText xml:space="preserve"> PAGEREF _Toc242096897 \h </w:instrText>
             </w:r>
             <w:r>
               <w:rPr>
@@ -2944,7 +3060,7 @@
               <w14:ligatures w14:val="standardContextual"/>
             </w:rPr>
           </w:pPr>
-          <w:hyperlink w:anchor="_Toc242095994" w:history="1">
+          <w:hyperlink w:anchor="_Toc242096898" w:history="1">
             <w:r>
               <w:rPr>
                 <w:rStyle w:val="Hyperlink"/>
@@ -2968,7 +3084,7 @@
               <w:rPr>
                 <w:noProof/>
               </w:rPr>
-              <w:instrText xml:space="preserve"> PAGEREF _Toc242095994 \h </w:instrText>
+              <w:instrText xml:space="preserve"> PAGEREF _Toc242096898 \h </w:instrText>
             </w:r>
             <w:r>
               <w:rPr>
@@ -3011,7 +3127,7 @@
               <w14:ligatures w14:val="standardContextual"/>
             </w:rPr>
           </w:pPr>
-          <w:hyperlink w:anchor="_Toc242095995" w:history="1">
+          <w:hyperlink w:anchor="_Toc242096899" w:history="1">
             <w:r>
               <w:rPr>
                 <w:rStyle w:val="Hyperlink"/>
@@ -3035,7 +3151,7 @@
               <w:rPr>
                 <w:noProof/>
               </w:rPr>
-              <w:instrText xml:space="preserve"> PAGEREF _Toc242095995 \h </w:instrText>
+              <w:instrText xml:space="preserve"> PAGEREF _Toc242096899 \h </w:instrText>
             </w:r>
             <w:r>
               <w:rPr>
@@ -3078,7 +3194,7 @@
               <w14:ligatures w14:val="standardContextual"/>
             </w:rPr>
           </w:pPr>
-          <w:hyperlink w:anchor="_Toc242095996" w:history="1">
+          <w:hyperlink w:anchor="_Toc242096900" w:history="1">
             <w:r>
               <w:rPr>
                 <w:rStyle w:val="Hyperlink"/>
@@ -3102,7 +3218,7 @@
               <w:rPr>
                 <w:noProof/>
               </w:rPr>
-              <w:instrText xml:space="preserve"> PAGEREF _Toc242095996 \h </w:instrText>
+              <w:instrText xml:space="preserve"> PAGEREF _Toc242096900 \h </w:instrText>
             </w:r>
             <w:r>
               <w:rPr>
@@ -3145,7 +3261,7 @@
               <w14:ligatures w14:val="standardContextual"/>
             </w:rPr>
           </w:pPr>
-          <w:hyperlink w:anchor="_Toc242095997" w:history="1">
+          <w:hyperlink w:anchor="_Toc242096901" w:history="1">
             <w:r>
               <w:rPr>
                 <w:rStyle w:val="Hyperlink"/>
@@ -3169,7 +3285,7 @@
               <w:rPr>
                 <w:noProof/>
               </w:rPr>
-              <w:instrText xml:space="preserve"> PAGEREF _Toc242095997 \h </w:instrText>
+              <w:instrText xml:space="preserve"> PAGEREF _Toc242096901 \h </w:instrText>
             </w:r>
             <w:r>
               <w:rPr>
@@ -3212,7 +3328,7 @@
               <w14:ligatures w14:val="standardContextual"/>
             </w:rPr>
           </w:pPr>
-          <w:hyperlink w:anchor="_Toc242095998" w:history="1">
+          <w:hyperlink w:anchor="_Toc242096902" w:history="1">
             <w:r>
               <w:rPr>
                 <w:rStyle w:val="Hyperlink"/>
@@ -3236,7 +3352,7 @@
               <w:rPr>
                 <w:noProof/>
               </w:rPr>
-              <w:instrText xml:space="preserve"> PAGEREF _Toc242095998 \h </w:instrText>
+              <w:instrText xml:space="preserve"> PAGEREF _Toc242096902 \h </w:instrText>
             </w:r>
             <w:r>
               <w:rPr>
@@ -3282,7 +3398,7 @@
     <w:sdt>
       <w:sdtPr>
         <w:alias w:val="Figures"/>
-        <w:id w:val="1945412386"/>
+        <w:id w:val="1117337300"/>
       </w:sdtPr>
       <w:sdtEndPr/>
       <w:sdtContent>
@@ -3311,7 +3427,7 @@
           <w:r>
             <w:fldChar w:fldCharType="separate"/>
           </w:r>
-          <w:hyperlink w:anchor="_Toc242095999" w:history="1">
+          <w:hyperlink w:anchor="_Toc242096903" w:history="1">
             <w:r>
               <w:rPr>
                 <w:rStyle w:val="Hyperlink"/>
@@ -3335,7 +3451,7 @@
               <w:rPr>
                 <w:noProof/>
               </w:rPr>
-              <w:instrText xml:space="preserve"> PAGEREF _Toc242095999 \h </w:instrText>
+              <w:instrText xml:space="preserve"> PAGEREF _Toc242096903 \h </w:instrText>
             </w:r>
             <w:r>
               <w:rPr>
@@ -3378,7 +3494,7 @@
               <w14:ligatures w14:val="standardContextual"/>
             </w:rPr>
           </w:pPr>
-          <w:hyperlink w:anchor="_Toc242096000" w:history="1">
+          <w:hyperlink w:anchor="_Toc242096904" w:history="1">
             <w:r>
               <w:rPr>
                 <w:rStyle w:val="Hyperlink"/>
@@ -3402,7 +3518,7 @@
               <w:rPr>
                 <w:noProof/>
               </w:rPr>
-              <w:instrText xml:space="preserve"> PAGEREF _Toc242096000 \h </w:instrText>
+              <w:instrText xml:space="preserve"> PAGEREF _Toc242096904 \h </w:instrText>
             </w:r>
             <w:r>
               <w:rPr>
@@ -3445,7 +3561,7 @@
               <w14:ligatures w14:val="standardContextual"/>
             </w:rPr>
           </w:pPr>
-          <w:hyperlink w:anchor="_Toc242096001" w:history="1">
+          <w:hyperlink w:anchor="_Toc242096905" w:history="1">
             <w:r>
               <w:rPr>
                 <w:rStyle w:val="Hyperlink"/>
@@ -3469,7 +3585,7 @@
               <w:rPr>
                 <w:noProof/>
               </w:rPr>
-              <w:instrText xml:space="preserve"> PAGEREF _Toc242096001 \h </w:instrText>
+              <w:instrText xml:space="preserve"> PAGEREF _Toc242096905 \h </w:instrText>
             </w:r>
             <w:r>
               <w:rPr>
@@ -3512,7 +3628,7 @@
               <w14:ligatures w14:val="standardContextual"/>
             </w:rPr>
           </w:pPr>
-          <w:hyperlink w:anchor="_Toc242096002" w:history="1">
+          <w:hyperlink w:anchor="_Toc242096906" w:history="1">
             <w:r>
               <w:rPr>
                 <w:rStyle w:val="Hyperlink"/>
@@ -3536,7 +3652,7 @@
               <w:rPr>
                 <w:noProof/>
               </w:rPr>
-              <w:instrText xml:space="preserve"> PAGEREF _Toc242096002 \h </w:instrText>
+              <w:instrText xml:space="preserve"> PAGEREF _Toc242096906 \h </w:instrText>
             </w:r>
             <w:r>
               <w:rPr>
@@ -3582,7 +3698,7 @@
     <w:sdt>
       <w:sdtPr>
         <w:alias w:val="Tables"/>
-        <w:id w:val="-1606190073"/>
+        <w:id w:val="-961882811"/>
       </w:sdtPr>
       <w:sdtEndPr/>
       <w:sdtContent>
@@ -3611,7 +3727,7 @@
           <w:r>
             <w:fldChar w:fldCharType="separate"/>
           </w:r>
-          <w:hyperlink w:anchor="_Toc242096003" w:history="1">
+          <w:hyperlink w:anchor="_Toc242096907" w:history="1">
             <w:r>
               <w:rPr>
                 <w:rStyle w:val="Hyperlink"/>
@@ -3635,7 +3751,7 @@
               <w:rPr>
                 <w:noProof/>
               </w:rPr>
-              <w:instrText xml:space="preserve"> PAGEREF _Toc242096003 \h </w:instrText>
+              <w:instrText xml:space="preserve"> PAGEREF _Toc242096907 \h </w:instrText>
             </w:r>
             <w:r>
               <w:rPr>
@@ -3678,7 +3794,7 @@
               <w14:ligatures w14:val="standardContextual"/>
             </w:rPr>
           </w:pPr>
-          <w:hyperlink w:anchor="_Toc242096004" w:history="1">
+          <w:hyperlink w:anchor="_Toc242096908" w:history="1">
             <w:r>
               <w:rPr>
                 <w:rStyle w:val="Hyperlink"/>
@@ -3702,7 +3818,7 @@
               <w:rPr>
                 <w:noProof/>
               </w:rPr>
-              <w:instrText xml:space="preserve"> PAGEREF _Toc242096004 \h </w:instrText>
+              <w:instrText xml:space="preserve"> PAGEREF _Toc242096908 \h </w:instrText>
             </w:r>
             <w:r>
               <w:rPr>
@@ -3745,7 +3861,7 @@
               <w14:ligatures w14:val="standardContextual"/>
             </w:rPr>
           </w:pPr>
-          <w:hyperlink w:anchor="_Toc242096005" w:history="1">
+          <w:hyperlink w:anchor="_Toc242096909" w:history="1">
             <w:r>
               <w:rPr>
                 <w:rStyle w:val="Hyperlink"/>
@@ -3769,7 +3885,7 @@
               <w:rPr>
                 <w:noProof/>
               </w:rPr>
-              <w:instrText xml:space="preserve"> PAGEREF _Toc242096005 \h </w:instrText>
+              <w:instrText xml:space="preserve"> PAGEREF _Toc242096909 \h </w:instrText>
             </w:r>
             <w:r>
               <w:rPr>
@@ -3812,7 +3928,7 @@
               <w14:ligatures w14:val="standardContextual"/>
             </w:rPr>
           </w:pPr>
-          <w:hyperlink w:anchor="_Toc242096006" w:history="1">
+          <w:hyperlink w:anchor="_Toc242096910" w:history="1">
             <w:r>
               <w:rPr>
                 <w:rStyle w:val="Hyperlink"/>
@@ -3836,7 +3952,7 @@
               <w:rPr>
                 <w:noProof/>
               </w:rPr>
-              <w:instrText xml:space="preserve"> PAGEREF _Toc242096006 \h </w:instrText>
+              <w:instrText xml:space="preserve"> PAGEREF _Toc242096910 \h </w:instrText>
             </w:r>
             <w:r>
               <w:rPr>
@@ -3879,7 +3995,7 @@
               <w14:ligatures w14:val="standardContextual"/>
             </w:rPr>
           </w:pPr>
-          <w:hyperlink w:anchor="_Toc242096007" w:history="1">
+          <w:hyperlink w:anchor="_Toc242096911" w:history="1">
             <w:r>
               <w:rPr>
                 <w:rStyle w:val="Hyperlink"/>
@@ -3903,7 +4019,7 @@
               <w:rPr>
                 <w:noProof/>
               </w:rPr>
-              <w:instrText xml:space="preserve"> PAGEREF _Toc242096007 \h </w:instrText>
+              <w:instrText xml:space="preserve"> PAGEREF _Toc242096911 \h </w:instrText>
             </w:r>
             <w:r>
               <w:rPr>
@@ -3946,7 +4062,7 @@
               <w14:ligatures w14:val="standardContextual"/>
             </w:rPr>
           </w:pPr>
-          <w:hyperlink w:anchor="_Toc242096008" w:history="1">
+          <w:hyperlink w:anchor="_Toc242096912" w:history="1">
             <w:r>
               <w:rPr>
                 <w:rStyle w:val="Hyperlink"/>
@@ -3970,7 +4086,7 @@
               <w:rPr>
                 <w:noProof/>
               </w:rPr>
-              <w:instrText xml:space="preserve"> PAGEREF _Toc242096008 \h </w:instrText>
+              <w:instrText xml:space="preserve"> PAGEREF _Toc242096912 \h </w:instrText>
             </w:r>
             <w:r>
               <w:rPr>
@@ -4011,7 +4127,7 @@
         <w:keepLines/>
         <w:pageBreakBefore/>
       </w:pPr>
-      <w:bookmarkStart w:id="0" w:name="_Toc242095978"/>
+      <w:bookmarkStart w:id="0" w:name="_Toc242096882"/>
       <w:r>
         <w:lastRenderedPageBreak/>
         <w:t>1 Introduction</w:t>
@@ -4024,7 +4140,7 @@
         <w:keepNext/>
         <w:keepLines/>
       </w:pPr>
-      <w:bookmarkStart w:id="1" w:name="_Toc242095979"/>
+      <w:bookmarkStart w:id="1" w:name="_Toc242096883"/>
       <w:r>
         <w:t>1.1 Purpose</w:t>
       </w:r>
@@ -4074,7 +4190,7 @@
         <w:keepNext/>
         <w:keepLines/>
       </w:pPr>
-      <w:bookmarkStart w:id="2" w:name="_Toc242095980"/>
+      <w:bookmarkStart w:id="2" w:name="_Toc242096884"/>
       <w:r>
         <w:t>1.2 Scope</w:t>
       </w:r>
@@ -4114,7 +4230,7 @@
         <w:keepNext/>
         <w:keepLines/>
       </w:pPr>
-      <w:bookmarkStart w:id="3" w:name="_Toc242095981"/>
+      <w:bookmarkStart w:id="3" w:name="_Toc242096885"/>
       <w:r>
         <w:t>1.3 Intended audience</w:t>
       </w:r>
@@ -4134,7 +4250,7 @@
         <w:keepNext/>
         <w:keepLines/>
       </w:pPr>
-      <w:bookmarkStart w:id="4" w:name="_Toc242095982"/>
+      <w:bookmarkStart w:id="4" w:name="_Toc242096886"/>
       <w:r>
         <w:t>1.4 Relationship to other documents</w:t>
       </w:r>
@@ -4145,7 +4261,7 @@
         <w:pStyle w:val="Caption"/>
         <w:keepNext/>
       </w:pPr>
-      <w:bookmarkStart w:id="5" w:name="_Toc242096003"/>
+      <w:bookmarkStart w:id="5" w:name="_Toc242096907"/>
       <w:r>
         <w:t xml:space="preserve">Table </w:t>
       </w:r>
@@ -4573,7 +4689,7 @@
         <w:keepNext/>
         <w:keepLines/>
       </w:pPr>
-      <w:bookmarkStart w:id="6" w:name="_Toc242095983"/>
+      <w:bookmarkStart w:id="6" w:name="_Toc242096887"/>
       <w:r>
         <w:t>1.5 Conventions</w:t>
       </w:r>
@@ -4672,7 +4788,7 @@
         <w:keepLines/>
         <w:pageBreakBefore/>
       </w:pPr>
-      <w:bookmarkStart w:id="7" w:name="_Toc242095984"/>
+      <w:bookmarkStart w:id="7" w:name="_Toc242096888"/>
       <w:r>
         <w:lastRenderedPageBreak/>
         <w:t>2 Actors</w:t>
@@ -4684,7 +4800,7 @@
         <w:pStyle w:val="Caption"/>
         <w:keepNext/>
       </w:pPr>
-      <w:bookmarkStart w:id="8" w:name="_Toc242096004"/>
+      <w:bookmarkStart w:id="8" w:name="_Toc242096908"/>
       <w:r>
         <w:t xml:space="preserve">Table </w:t>
       </w:r>
@@ -5781,7 +5897,7 @@
         <w:keepLines/>
         <w:pageBreakBefore/>
       </w:pPr>
-      <w:bookmarkStart w:id="9" w:name="_Toc242095985"/>
+      <w:bookmarkStart w:id="9" w:name="_Toc242096889"/>
       <w:r>
         <w:lastRenderedPageBreak/>
         <w:t>3 Use case diagrams</w:t>
@@ -5799,7 +5915,7 @@
           <w:noProof/>
         </w:rPr>
         <w:drawing>
-          <wp:inline distT="0" distB="0" distL="0" distR="0" wp14:anchorId="21060C4A" wp14:editId="21060C4B">
+          <wp:inline distT="0" distB="0" distL="0" distR="0" wp14:anchorId="05BC17A8" wp14:editId="05BC17A9">
             <wp:extent cx="5676900" cy="8191500"/>
             <wp:effectExtent l="0" t="0" r="0" b="0"/>
             <wp:docPr id="1" name="uc-student.png" descr="Student services: use cases of the student and the systems that support them" title="Student services: use cases of the student and the systems that support them"/>
@@ -5842,7 +5958,7 @@
       <w:pPr>
         <w:pStyle w:val="Caption"/>
       </w:pPr>
-      <w:bookmarkStart w:id="10" w:name="_Toc242095999"/>
+      <w:bookmarkStart w:id="10" w:name="_Toc242096903"/>
       <w:r>
         <w:t xml:space="preserve">Figure </w:t>
       </w:r>
@@ -5881,7 +5997,7 @@
         </w:rPr>
         <w:lastRenderedPageBreak/>
         <w:drawing>
-          <wp:inline distT="0" distB="0" distL="0" distR="0" wp14:anchorId="21060C4C" wp14:editId="21060C4D">
+          <wp:inline distT="0" distB="0" distL="0" distR="0" wp14:anchorId="05BC17AA" wp14:editId="05BC17AB">
             <wp:extent cx="6124575" cy="3705225"/>
             <wp:effectExtent l="0" t="0" r="0" b="0"/>
             <wp:docPr id="2" name="uc-backoffice.png" descr="Data, trust and community services: use cases of the curator, scheduler, teacher and senior" title="Data, trust and community services: use cases of the curator, scheduler, teacher and senior"/>
@@ -5924,7 +6040,7 @@
       <w:pPr>
         <w:pStyle w:val="Caption"/>
       </w:pPr>
-      <w:bookmarkStart w:id="11" w:name="_Toc242096000"/>
+      <w:bookmarkStart w:id="11" w:name="_Toc242096904"/>
       <w:r>
         <w:t xml:space="preserve">Figure </w:t>
       </w:r>
@@ -5958,7 +6074,7 @@
         <w:keepLines/>
         <w:pageBreakBefore/>
       </w:pPr>
-      <w:bookmarkStart w:id="12" w:name="_Toc242095986"/>
+      <w:bookmarkStart w:id="12" w:name="_Toc242096890"/>
       <w:r>
         <w:lastRenderedPageBreak/>
         <w:t>4 Use case catalogue</w:t>
@@ -5970,7 +6086,7 @@
         <w:pStyle w:val="Caption"/>
         <w:keepNext/>
       </w:pPr>
-      <w:bookmarkStart w:id="13" w:name="_Toc242096005"/>
+      <w:bookmarkStart w:id="13" w:name="_Toc242096909"/>
       <w:r>
         <w:t xml:space="preserve">Table </w:t>
       </w:r>
@@ -6424,7 +6540,7 @@
                 <w:sz w:val="19"/>
                 <w:szCs w:val="19"/>
               </w:rPr>
-              <w:t>FR-101 to FR-112</w:t>
+              <w:t>FR-101 to FR-113</w:t>
             </w:r>
           </w:p>
         </w:tc>
@@ -7009,7 +7125,7 @@
                 <w:sz w:val="19"/>
                 <w:szCs w:val="19"/>
               </w:rPr>
-              <w:t>FR-301 to FR-307</w:t>
+              <w:t>FR-301 to FR-308</w:t>
             </w:r>
           </w:p>
         </w:tc>
@@ -9743,7 +9859,7 @@
         <w:keepLines/>
         <w:pageBreakBefore/>
       </w:pPr>
-      <w:bookmarkStart w:id="14" w:name="_Toc242095987"/>
+      <w:bookmarkStart w:id="14" w:name="_Toc242096891"/>
       <w:r>
         <w:lastRenderedPageBreak/>
         <w:t>5 Fully dressed use cases</w:t>
@@ -9756,7 +9872,7 @@
         <w:keepNext/>
         <w:keepLines/>
       </w:pPr>
-      <w:bookmarkStart w:id="15" w:name="_Toc242095988"/>
+      <w:bookmarkStart w:id="15" w:name="_Toc242096892"/>
       <w:r>
         <w:t>5.1 UC-01 Set up profile</w:t>
       </w:r>
@@ -10573,10 +10689,7 @@
         <w:t>2b. The student chooses "Read my results sheet":</w:t>
       </w:r>
       <w:r>
-        <w:t xml:space="preserve"> the student photographs the results sheet; the system </w:t>
-      </w:r>
-      <w:r>
-        <w:t>reads the fields (FR-109), highlights low-confidence fields (FR-110), deletes the photo (FR-111), and the student confirms or corrects each field; continue at step 5.</w:t>
+        <w:t xml:space="preserve"> the student photographs the results sheet; the system reads the fields (FR-109), highlights low-confidence fields (FR-110), deletes the photo (FR-111), and the student confirms or corrects each field; continue at step 5.</w:t>
       </w:r>
     </w:p>
     <w:p>
@@ -10616,7 +10729,10 @@
         <w:t>5b. The subject combination is not admissible for the stream:</w:t>
       </w:r>
       <w:r>
-        <w:t xml:space="preserve"> the system names the subject that does not fit (FR-103); resume at step 4.</w:t>
+        <w:t xml:space="preserve"> the system names the subject that does not </w:t>
+      </w:r>
+      <w:r>
+        <w:t>fit (FR-103); resume at step 4.</w:t>
       </w:r>
     </w:p>
     <w:p>
@@ -10820,7 +10936,7 @@
         <w:keepNext/>
         <w:keepLines/>
       </w:pPr>
-      <w:bookmarkStart w:id="16" w:name="_Toc242095989"/>
+      <w:bookmarkStart w:id="16" w:name="_Toc242096893"/>
       <w:r>
         <w:t>5.2 UC-02 Explore eligible courses</w:t>
       </w:r>
@@ -11698,7 +11814,10 @@
         <w:t>5a. The student marks an offering as a dream course:</w:t>
       </w:r>
       <w:r>
-        <w:t xml:space="preserve"> the system shows the gap and up to three nearby open offerings (FR-211, FR-212).</w:t>
+        <w:t xml:space="preserve"> the system shows the gap and up to three nearby open </w:t>
+      </w:r>
+      <w:r>
+        <w:t>offerings (FR-211, FR-212).</w:t>
       </w:r>
     </w:p>
     <w:p>
@@ -11828,7 +11947,7 @@
         <w:keepNext/>
         <w:keepLines/>
       </w:pPr>
-      <w:bookmarkStart w:id="17" w:name="_Toc242095990"/>
+      <w:bookmarkStart w:id="17" w:name="_Toc242096894"/>
       <w:r>
         <w:t>5.3 UC-04 Build and check preference list</w:t>
       </w:r>
@@ -12663,10 +12782,7 @@
         <w:t>3b. The list exceeds the maximum number of preferences allowed (BR-043):</w:t>
       </w:r>
       <w:r>
-        <w:t xml:space="preserve"> the system prevents further </w:t>
-      </w:r>
-      <w:r>
-        <w:t>additions and explains the limit.</w:t>
+        <w:t xml:space="preserve"> the system prevents further additions and explains the limit.</w:t>
       </w:r>
     </w:p>
     <w:p>
@@ -12689,7 +12805,7 @@
         </w:rPr>
         <w:lastRenderedPageBreak/>
         <w:drawing>
-          <wp:inline distT="0" distB="0" distL="0" distR="0" wp14:anchorId="21060C4E" wp14:editId="21060C4F">
+          <wp:inline distT="0" distB="0" distL="0" distR="0" wp14:anchorId="05BC17AC" wp14:editId="05BC17AD">
             <wp:extent cx="3648075" cy="8191500"/>
             <wp:effectExtent l="0" t="0" r="0" b="0"/>
             <wp:docPr id="3" name="act-list-check.png" descr="Activity flow of UC-04: adding, checking and fixing the preference list" title="Activity flow of UC-04: adding, checking and fixing the preference list"/>
@@ -12732,7 +12848,7 @@
       <w:pPr>
         <w:pStyle w:val="Caption"/>
       </w:pPr>
-      <w:bookmarkStart w:id="18" w:name="_Toc242096001"/>
+      <w:bookmarkStart w:id="18" w:name="_Toc242096905"/>
       <w:r>
         <w:t xml:space="preserve">Figure </w:t>
       </w:r>
@@ -12765,7 +12881,7 @@
         <w:keepNext/>
         <w:keepLines/>
       </w:pPr>
-      <w:bookmarkStart w:id="19" w:name="_Toc242095991"/>
+      <w:bookmarkStart w:id="19" w:name="_Toc242096895"/>
       <w:r>
         <w:lastRenderedPageBreak/>
         <w:t>5.4 UC-07 Ask a question</w:t>
@@ -13693,7 +13809,7 @@
         <w:keepNext/>
         <w:keepLines/>
       </w:pPr>
-      <w:bookmarkStart w:id="20" w:name="_Toc242095992"/>
+      <w:bookmarkStart w:id="20" w:name="_Toc242096896"/>
       <w:r>
         <w:t>5.5 UC-11 Extract facts from a source</w:t>
       </w:r>
@@ -14583,7 +14699,7 @@
           <w:noProof/>
         </w:rPr>
         <w:drawing>
-          <wp:inline distT="0" distB="0" distL="0" distR="0" wp14:anchorId="21060C50" wp14:editId="21060C51">
+          <wp:inline distT="0" distB="0" distL="0" distR="0" wp14:anchorId="05BC17AE" wp14:editId="05BC17AF">
             <wp:extent cx="6124575" cy="5514975"/>
             <wp:effectExtent l="0" t="0" r="0" b="0"/>
             <wp:docPr id="4" name="act-extraction.png" descr="Activity flow of UC-11 and UC-12: extraction, two-model check and curator review" title="Activity flow of UC-11 and UC-12: extraction, two-model check and curator review"/>
@@ -14626,7 +14742,7 @@
       <w:pPr>
         <w:pStyle w:val="Caption"/>
       </w:pPr>
-      <w:bookmarkStart w:id="21" w:name="_Toc242096002"/>
+      <w:bookmarkStart w:id="21" w:name="_Toc242096906"/>
       <w:r>
         <w:t xml:space="preserve">Figure </w:t>
       </w:r>
@@ -14659,7 +14775,7 @@
         <w:keepNext/>
         <w:keepLines/>
       </w:pPr>
-      <w:bookmarkStart w:id="22" w:name="_Toc242095993"/>
+      <w:bookmarkStart w:id="22" w:name="_Toc242096897"/>
       <w:r>
         <w:t>5.6 UC-12 Review queued facts and reports</w:t>
       </w:r>
@@ -15241,7 +15357,7 @@
         <w:keepNext/>
         <w:keepLines/>
       </w:pPr>
-      <w:bookmarkStart w:id="23" w:name="_Toc242095994"/>
+      <w:bookmarkStart w:id="23" w:name="_Toc242096898"/>
       <w:r>
         <w:t>5.7 UC-13 Scan Gazette</w:t>
       </w:r>
@@ -15749,7 +15865,7 @@
         <w:keepLines/>
         <w:pageBreakBefore/>
       </w:pPr>
-      <w:bookmarkStart w:id="24" w:name="_Toc242095995"/>
+      <w:bookmarkStart w:id="24" w:name="_Toc242096899"/>
       <w:r>
         <w:lastRenderedPageBreak/>
         <w:t>6 Brief use cases</w:t>
@@ -15761,7 +15877,7 @@
         <w:pStyle w:val="Caption"/>
         <w:keepNext/>
       </w:pPr>
-      <w:bookmarkStart w:id="25" w:name="_Toc242096006"/>
+      <w:bookmarkStart w:id="25" w:name="_Toc242096910"/>
       <w:r>
         <w:t xml:space="preserve">Table </w:t>
       </w:r>
@@ -17079,7 +17195,7 @@
         <w:keepLines/>
         <w:pageBreakBefore/>
       </w:pPr>
-      <w:bookmarkStart w:id="26" w:name="_Toc242095996"/>
+      <w:bookmarkStart w:id="26" w:name="_Toc242096900"/>
       <w:r>
         <w:lastRenderedPageBreak/>
         <w:t>Appendix A: Traceability: requirements to use cases</w:t>
@@ -17104,7 +17220,7 @@
         <w:t>Requirements</w:t>
       </w:r>
       <w:r>
-        <w:t>); this was checked by script against all 78 requirements.</w:t>
+        <w:t>); this was checked by script against all 80 requirements.</w:t>
       </w:r>
     </w:p>
     <w:p>
@@ -17114,7 +17230,7 @@
         <w:keepLines/>
         <w:pageBreakBefore/>
       </w:pPr>
-      <w:bookmarkStart w:id="27" w:name="_Toc242095997"/>
+      <w:bookmarkStart w:id="27" w:name="_Toc242096901"/>
       <w:r>
         <w:lastRenderedPageBreak/>
         <w:t>Appendix B: Glossary</w:t>
@@ -17126,7 +17242,7 @@
         <w:pStyle w:val="Caption"/>
         <w:keepNext/>
       </w:pPr>
-      <w:bookmarkStart w:id="28" w:name="_Toc242096007"/>
+      <w:bookmarkStart w:id="28" w:name="_Toc242096911"/>
       <w:r>
         <w:t xml:space="preserve">Table </w:t>
       </w:r>
@@ -17699,7 +17815,7 @@
         <w:keepLines/>
         <w:pageBreakBefore/>
       </w:pPr>
-      <w:bookmarkStart w:id="29" w:name="_Toc242095998"/>
+      <w:bookmarkStart w:id="29" w:name="_Toc242096902"/>
       <w:r>
         <w:lastRenderedPageBreak/>
         <w:t>Appendix C: References</w:t>
@@ -17711,7 +17827,7 @@
         <w:pStyle w:val="Caption"/>
         <w:keepNext/>
       </w:pPr>
-      <w:bookmarkStart w:id="30" w:name="_Toc242096008"/>
+      <w:bookmarkStart w:id="30" w:name="_Toc242096912"/>
       <w:r>
         <w:t xml:space="preserve">Table </w:t>
       </w:r>
@@ -18345,134 +18461,10 @@
 <file path=word/numbering.xml><?xml version="1.0" encoding="utf-8"?>
 <w:numbering xmlns:wpc="http://schemas.microsoft.com/office/word/2010/wordprocessingCanvas" xmlns:cx="http://schemas.microsoft.com/office/drawing/2014/chartex" xmlns:cx1="http://schemas.microsoft.com/office/drawing/2015/9/8/chartex" xmlns:cx2="http://schemas.microsoft.com/office/drawing/2015/10/21/chartex" xmlns:cx3="http://schemas.microsoft.com/office/drawing/2016/5/9/chartex" xmlns:cx4="http://schemas.microsoft.com/office/drawing/2016/5/10/chartex" xmlns:cx5="http://schemas.microsoft.com/office/drawing/2016/5/11/chartex" xmlns:cx6="http://schemas.microsoft.com/office/drawing/2016/5/12/chartex" xmlns:cx7="http://schemas.microsoft.com/office/drawing/2016/5/13/chartex" xmlns:cx8="http://schemas.microsoft.com/office/drawing/2016/5/14/chartex" xmlns:mc="http://schemas.openxmlformats.org/markup-compatibility/2006" xmlns:aink="http://schemas.microsoft.com/office/drawing/2016/ink" xmlns:am3d="http://schemas.microsoft.com/office/drawing/2017/model3d" xmlns:o="urn:schemas-microsoft-com:office:office" xmlns:oel="http://schemas.microsoft.com/office/2019/extlst" xmlns:r="http://schemas.openxmlformats.org/officeDocument/2006/relationships" xmlns:m="http://schemas.openxmlformats.org/officeDocument/2006/math" xmlns:v="urn:schemas-microsoft-com:vml" xmlns:wp14="http://schemas.microsoft.com/office/word/2010/wordprocessingDrawing" xmlns:wp="http://schemas.openxmlformats.org/drawingml/2006/wordprocessingDrawing" xmlns:w10="urn:schemas-microsoft-com:office:word" xmlns:w="http://schemas.openxmlformats.org/wordprocessingml/2006/main" xmlns:w14="http://schemas.microsoft.com/office/word/2010/wordml" xmlns:w15="http://schemas.microsoft.com/office/word/2012/wordml" xmlns:w16cex="http://schemas.microsoft.com/office/word/2018/wordml/cex" xmlns:w16cid="http://schemas.microsoft.com/office/word/2016/wordml/cid" xmlns:w16="http://schemas.microsoft.com/office/word/2018/wordml" xmlns:w16du="http://schemas.microsoft.com/office/word/2023/wordml/word16du" xmlns:w16sdtdh="http://schemas.microsoft.com/office/word/2020/wordml/sdtdatahash" xmlns:w16sdtfl="http://schemas.microsoft.com/office/word/2024/wordml/sdtformatlock" xmlns:w16se="http://schemas.microsoft.com/office/word/2015/wordml/symex" xmlns:wpg="http://schemas.microsoft.com/office/word/2010/wordprocessingGroup" xmlns:wpi="http://schemas.microsoft.com/office/word/2010/wordprocessingInk" xmlns:wne="http://schemas.microsoft.com/office/word/2006/wordml" xmlns:wps="http://schemas.microsoft.com/office/word/2010/wordprocessingShape" mc:Ignorable="w14 w15 w16se w16cid w16 w16cex w16sdtdh w16sdtfl w16du wp14">
   <w:abstractNum w:abstractNumId="0" w15:restartNumberingAfterBreak="0">
-    <w:nsid w:val="6F08566B"/>
+    <w:nsid w:val="1B80297B"/>
     <w:multiLevelType w:val="hybridMultilevel"/>
-    <w:tmpl w:val="37F8A084"/>
-    <w:lvl w:ilvl="0" w:tplc="5FF49660">
-      <w:start w:val="1"/>
-      <w:numFmt w:val="bullet"/>
-      <w:lvlText w:val="•"/>
-      <w:lvlJc w:val="left"/>
-      <w:pPr>
-        <w:ind w:left="720" w:hanging="280"/>
-      </w:pPr>
-    </w:lvl>
-    <w:lvl w:ilvl="1" w:tplc="5998AE76" w:tentative="1">
-      <w:start w:val="1"/>
-      <w:numFmt w:val="bullet"/>
-      <w:lvlText w:val="–"/>
-      <w:lvlJc w:val="left"/>
-      <w:pPr>
-        <w:ind w:left="1080" w:hanging="280"/>
-      </w:pPr>
-    </w:lvl>
-    <w:lvl w:ilvl="2" w:tplc="8C5ACC0C" w:tentative="1">
-      <w:start w:val="1"/>
-      <w:numFmt w:val="bullet"/>
-      <w:lvlText w:val="▪"/>
-      <w:lvlJc w:val="left"/>
-      <w:pPr>
-        <w:ind w:left="1440" w:hanging="280"/>
-      </w:pPr>
-    </w:lvl>
-    <w:lvl w:ilvl="3" w:tplc="73FE47B6">
-      <w:numFmt w:val="decimal"/>
-      <w:lvlText w:val=""/>
-      <w:lvlJc w:val="left"/>
-    </w:lvl>
-    <w:lvl w:ilvl="4" w:tplc="9BE415A8">
-      <w:numFmt w:val="decimal"/>
-      <w:lvlText w:val=""/>
-      <w:lvlJc w:val="left"/>
-    </w:lvl>
-    <w:lvl w:ilvl="5" w:tplc="3CB08ABE">
-      <w:numFmt w:val="decimal"/>
-      <w:lvlText w:val=""/>
-      <w:lvlJc w:val="left"/>
-    </w:lvl>
-    <w:lvl w:ilvl="6" w:tplc="08248822">
-      <w:numFmt w:val="decimal"/>
-      <w:lvlText w:val=""/>
-      <w:lvlJc w:val="left"/>
-    </w:lvl>
-    <w:lvl w:ilvl="7" w:tplc="19985D3C">
-      <w:numFmt w:val="decimal"/>
-      <w:lvlText w:val=""/>
-      <w:lvlJc w:val="left"/>
-    </w:lvl>
-    <w:lvl w:ilvl="8" w:tplc="4D38D590">
-      <w:numFmt w:val="decimal"/>
-      <w:lvlText w:val=""/>
-      <w:lvlJc w:val="left"/>
-    </w:lvl>
-  </w:abstractNum>
-  <w:abstractNum w:abstractNumId="1" w15:restartNumberingAfterBreak="0">
-    <w:nsid w:val="70787A1C"/>
-    <w:multiLevelType w:val="hybridMultilevel"/>
-    <w:tmpl w:val="CE80919C"/>
-    <w:lvl w:ilvl="0" w:tplc="A5D42570">
-      <w:start w:val="1"/>
-      <w:numFmt w:val="decimal"/>
-      <w:lvlText w:val="%1."/>
-      <w:lvlJc w:val="left"/>
-      <w:pPr>
-        <w:ind w:left="720" w:hanging="360"/>
-      </w:pPr>
-    </w:lvl>
-    <w:lvl w:ilvl="1" w:tplc="A7E0D054" w:tentative="1">
-      <w:start w:val="1"/>
-      <w:numFmt w:val="lowerLetter"/>
-      <w:lvlText w:val="%2."/>
-      <w:lvlJc w:val="left"/>
-      <w:pPr>
-        <w:ind w:left="1080" w:hanging="360"/>
-      </w:pPr>
-    </w:lvl>
-    <w:lvl w:ilvl="2" w:tplc="DF80DD7E" w:tentative="1">
-      <w:start w:val="1"/>
-      <w:numFmt w:val="lowerRoman"/>
-      <w:lvlText w:val="%3."/>
-      <w:lvlJc w:val="left"/>
-      <w:pPr>
-        <w:ind w:left="1440" w:hanging="360"/>
-      </w:pPr>
-    </w:lvl>
-    <w:lvl w:ilvl="3" w:tplc="BFB63C12">
-      <w:numFmt w:val="decimal"/>
-      <w:lvlText w:val=""/>
-      <w:lvlJc w:val="left"/>
-    </w:lvl>
-    <w:lvl w:ilvl="4" w:tplc="0E308898">
-      <w:numFmt w:val="decimal"/>
-      <w:lvlText w:val=""/>
-      <w:lvlJc w:val="left"/>
-    </w:lvl>
-    <w:lvl w:ilvl="5" w:tplc="95B6E93A">
-      <w:numFmt w:val="decimal"/>
-      <w:lvlText w:val=""/>
-      <w:lvlJc w:val="left"/>
-    </w:lvl>
-    <w:lvl w:ilvl="6" w:tplc="FC667500">
-      <w:numFmt w:val="decimal"/>
-      <w:lvlText w:val=""/>
-      <w:lvlJc w:val="left"/>
-    </w:lvl>
-    <w:lvl w:ilvl="7" w:tplc="252A0D6A">
-      <w:numFmt w:val="decimal"/>
-      <w:lvlText w:val=""/>
-      <w:lvlJc w:val="left"/>
-    </w:lvl>
-    <w:lvl w:ilvl="8" w:tplc="05F26CAC">
-      <w:numFmt w:val="decimal"/>
-      <w:lvlText w:val=""/>
-      <w:lvlJc w:val="left"/>
-    </w:lvl>
-  </w:abstractNum>
-  <w:abstractNum w:abstractNumId="2" w15:restartNumberingAfterBreak="0">
-    <w:nsid w:val="7FAE7F31"/>
-    <w:multiLevelType w:val="hybridMultilevel"/>
-    <w:tmpl w:val="9B464B98"/>
-    <w:lvl w:ilvl="0" w:tplc="6ED20B76" w:tentative="1">
+    <w:tmpl w:val="FBD82432"/>
+    <w:lvl w:ilvl="0" w:tplc="FC027F2A" w:tentative="1">
       <w:start w:val="1"/>
       <w:numFmt w:val="bullet"/>
       <w:lvlText w:val="●"/>
@@ -18481,7 +18473,7 @@
         <w:ind w:left="720" w:hanging="360"/>
       </w:pPr>
     </w:lvl>
-    <w:lvl w:ilvl="1" w:tplc="2DA6BDF8" w:tentative="1">
+    <w:lvl w:ilvl="1" w:tplc="E32A7DC2" w:tentative="1">
       <w:start w:val="1"/>
       <w:numFmt w:val="bullet"/>
       <w:lvlText w:val="○"/>
@@ -18490,7 +18482,7 @@
         <w:ind w:left="1440" w:hanging="360"/>
       </w:pPr>
     </w:lvl>
-    <w:lvl w:ilvl="2" w:tplc="67D6EC5E" w:tentative="1">
+    <w:lvl w:ilvl="2" w:tplc="F1AC1D62" w:tentative="1">
       <w:start w:val="1"/>
       <w:numFmt w:val="bullet"/>
       <w:lvlText w:val="■"/>
@@ -18499,7 +18491,7 @@
         <w:ind w:left="2160" w:hanging="360"/>
       </w:pPr>
     </w:lvl>
-    <w:lvl w:ilvl="3" w:tplc="83E0A79A" w:tentative="1">
+    <w:lvl w:ilvl="3" w:tplc="7FC42978" w:tentative="1">
       <w:start w:val="1"/>
       <w:numFmt w:val="bullet"/>
       <w:lvlText w:val="●"/>
@@ -18508,7 +18500,7 @@
         <w:ind w:left="2880" w:hanging="360"/>
       </w:pPr>
     </w:lvl>
-    <w:lvl w:ilvl="4" w:tplc="6D5A8C42" w:tentative="1">
+    <w:lvl w:ilvl="4" w:tplc="62E692F2" w:tentative="1">
       <w:start w:val="1"/>
       <w:numFmt w:val="bullet"/>
       <w:lvlText w:val="○"/>
@@ -18517,7 +18509,7 @@
         <w:ind w:left="3600" w:hanging="360"/>
       </w:pPr>
     </w:lvl>
-    <w:lvl w:ilvl="5" w:tplc="643A83DE" w:tentative="1">
+    <w:lvl w:ilvl="5" w:tplc="C23647F8" w:tentative="1">
       <w:start w:val="1"/>
       <w:numFmt w:val="bullet"/>
       <w:lvlText w:val="■"/>
@@ -18526,7 +18518,7 @@
         <w:ind w:left="4320" w:hanging="360"/>
       </w:pPr>
     </w:lvl>
-    <w:lvl w:ilvl="6" w:tplc="4EB4B3EC" w:tentative="1">
+    <w:lvl w:ilvl="6" w:tplc="7DF83768" w:tentative="1">
       <w:start w:val="1"/>
       <w:numFmt w:val="bullet"/>
       <w:lvlText w:val="●"/>
@@ -18535,7 +18527,7 @@
         <w:ind w:left="5040" w:hanging="360"/>
       </w:pPr>
     </w:lvl>
-    <w:lvl w:ilvl="7" w:tplc="D2ACA7C0" w:tentative="1">
+    <w:lvl w:ilvl="7" w:tplc="10C6E878" w:tentative="1">
       <w:start w:val="1"/>
       <w:numFmt w:val="bullet"/>
       <w:lvlText w:val="●"/>
@@ -18544,7 +18536,7 @@
         <w:ind w:left="5760" w:hanging="360"/>
       </w:pPr>
     </w:lvl>
-    <w:lvl w:ilvl="8" w:tplc="E918CD7C" w:tentative="1">
+    <w:lvl w:ilvl="8" w:tplc="E6F864AA" w:tentative="1">
       <w:start w:val="1"/>
       <w:numFmt w:val="bullet"/>
       <w:lvlText w:val="●"/>
@@ -18554,98 +18546,222 @@
       </w:pPr>
     </w:lvl>
   </w:abstractNum>
-  <w:num w:numId="1" w16cid:durableId="79105591">
+  <w:abstractNum w:abstractNumId="1" w15:restartNumberingAfterBreak="0">
+    <w:nsid w:val="6CF53C2D"/>
+    <w:multiLevelType w:val="hybridMultilevel"/>
+    <w:tmpl w:val="BB8EAFD2"/>
+    <w:lvl w:ilvl="0" w:tplc="A60EE98E">
+      <w:start w:val="1"/>
+      <w:numFmt w:val="bullet"/>
+      <w:lvlText w:val="•"/>
+      <w:lvlJc w:val="left"/>
+      <w:pPr>
+        <w:ind w:left="720" w:hanging="280"/>
+      </w:pPr>
+    </w:lvl>
+    <w:lvl w:ilvl="1" w:tplc="A4BC3FE6" w:tentative="1">
+      <w:start w:val="1"/>
+      <w:numFmt w:val="bullet"/>
+      <w:lvlText w:val="–"/>
+      <w:lvlJc w:val="left"/>
+      <w:pPr>
+        <w:ind w:left="1080" w:hanging="280"/>
+      </w:pPr>
+    </w:lvl>
+    <w:lvl w:ilvl="2" w:tplc="E09082BC" w:tentative="1">
+      <w:start w:val="1"/>
+      <w:numFmt w:val="bullet"/>
+      <w:lvlText w:val="▪"/>
+      <w:lvlJc w:val="left"/>
+      <w:pPr>
+        <w:ind w:left="1440" w:hanging="280"/>
+      </w:pPr>
+    </w:lvl>
+    <w:lvl w:ilvl="3" w:tplc="FDE4AD1C">
+      <w:numFmt w:val="decimal"/>
+      <w:lvlText w:val=""/>
+      <w:lvlJc w:val="left"/>
+    </w:lvl>
+    <w:lvl w:ilvl="4" w:tplc="AF722B26">
+      <w:numFmt w:val="decimal"/>
+      <w:lvlText w:val=""/>
+      <w:lvlJc w:val="left"/>
+    </w:lvl>
+    <w:lvl w:ilvl="5" w:tplc="A5D2D940">
+      <w:numFmt w:val="decimal"/>
+      <w:lvlText w:val=""/>
+      <w:lvlJc w:val="left"/>
+    </w:lvl>
+    <w:lvl w:ilvl="6" w:tplc="2C4495BE">
+      <w:numFmt w:val="decimal"/>
+      <w:lvlText w:val=""/>
+      <w:lvlJc w:val="left"/>
+    </w:lvl>
+    <w:lvl w:ilvl="7" w:tplc="410AA5D6">
+      <w:numFmt w:val="decimal"/>
+      <w:lvlText w:val=""/>
+      <w:lvlJc w:val="left"/>
+    </w:lvl>
+    <w:lvl w:ilvl="8" w:tplc="8A04217A">
+      <w:numFmt w:val="decimal"/>
+      <w:lvlText w:val=""/>
+      <w:lvlJc w:val="left"/>
+    </w:lvl>
+  </w:abstractNum>
+  <w:abstractNum w:abstractNumId="2" w15:restartNumberingAfterBreak="0">
+    <w:nsid w:val="704B35B4"/>
+    <w:multiLevelType w:val="hybridMultilevel"/>
+    <w:tmpl w:val="FDF8AAF6"/>
+    <w:lvl w:ilvl="0" w:tplc="44F6F768">
+      <w:start w:val="1"/>
+      <w:numFmt w:val="decimal"/>
+      <w:lvlText w:val="%1."/>
+      <w:lvlJc w:val="left"/>
+      <w:pPr>
+        <w:ind w:left="720" w:hanging="360"/>
+      </w:pPr>
+    </w:lvl>
+    <w:lvl w:ilvl="1" w:tplc="EED88C5C" w:tentative="1">
+      <w:start w:val="1"/>
+      <w:numFmt w:val="lowerLetter"/>
+      <w:lvlText w:val="%2."/>
+      <w:lvlJc w:val="left"/>
+      <w:pPr>
+        <w:ind w:left="1080" w:hanging="360"/>
+      </w:pPr>
+    </w:lvl>
+    <w:lvl w:ilvl="2" w:tplc="31BC52F6" w:tentative="1">
+      <w:start w:val="1"/>
+      <w:numFmt w:val="lowerRoman"/>
+      <w:lvlText w:val="%3."/>
+      <w:lvlJc w:val="left"/>
+      <w:pPr>
+        <w:ind w:left="1440" w:hanging="360"/>
+      </w:pPr>
+    </w:lvl>
+    <w:lvl w:ilvl="3" w:tplc="13840E96">
+      <w:numFmt w:val="decimal"/>
+      <w:lvlText w:val=""/>
+      <w:lvlJc w:val="left"/>
+    </w:lvl>
+    <w:lvl w:ilvl="4" w:tplc="D93A29B0">
+      <w:numFmt w:val="decimal"/>
+      <w:lvlText w:val=""/>
+      <w:lvlJc w:val="left"/>
+    </w:lvl>
+    <w:lvl w:ilvl="5" w:tplc="99C0F42A">
+      <w:numFmt w:val="decimal"/>
+      <w:lvlText w:val=""/>
+      <w:lvlJc w:val="left"/>
+    </w:lvl>
+    <w:lvl w:ilvl="6" w:tplc="71649990">
+      <w:numFmt w:val="decimal"/>
+      <w:lvlText w:val=""/>
+      <w:lvlJc w:val="left"/>
+    </w:lvl>
+    <w:lvl w:ilvl="7" w:tplc="CE948ABC">
+      <w:numFmt w:val="decimal"/>
+      <w:lvlText w:val=""/>
+      <w:lvlJc w:val="left"/>
+    </w:lvl>
+    <w:lvl w:ilvl="8" w:tplc="CFACAD8C">
+      <w:numFmt w:val="decimal"/>
+      <w:lvlText w:val=""/>
+      <w:lvlJc w:val="left"/>
+    </w:lvl>
+  </w:abstractNum>
+  <w:num w:numId="1" w16cid:durableId="920870630">
+    <w:abstractNumId w:val="0"/>
+    <w:lvlOverride w:ilvl="0">
+      <w:startOverride w:val="1"/>
+    </w:lvlOverride>
+  </w:num>
+  <w:num w:numId="2" w16cid:durableId="1522165251">
+    <w:abstractNumId w:val="1"/>
+    <w:lvlOverride w:ilvl="0">
+      <w:startOverride w:val="1"/>
+    </w:lvlOverride>
+  </w:num>
+  <w:num w:numId="3" w16cid:durableId="15888446">
     <w:abstractNumId w:val="2"/>
     <w:lvlOverride w:ilvl="0">
       <w:startOverride w:val="1"/>
     </w:lvlOverride>
   </w:num>
-  <w:num w:numId="2" w16cid:durableId="524637750">
-    <w:abstractNumId w:val="0"/>
-    <w:lvlOverride w:ilvl="0">
-      <w:startOverride w:val="1"/>
-    </w:lvlOverride>
-  </w:num>
-  <w:num w:numId="3" w16cid:durableId="1664699044">
+  <w:num w:numId="4" w16cid:durableId="322048402">
     <w:abstractNumId w:val="1"/>
     <w:lvlOverride w:ilvl="0">
       <w:startOverride w:val="1"/>
     </w:lvlOverride>
   </w:num>
-  <w:num w:numId="4" w16cid:durableId="705906284">
-    <w:abstractNumId w:val="0"/>
+  <w:num w:numId="5" w16cid:durableId="1393312226">
+    <w:abstractNumId w:val="2"/>
     <w:lvlOverride w:ilvl="0">
       <w:startOverride w:val="1"/>
     </w:lvlOverride>
   </w:num>
-  <w:num w:numId="5" w16cid:durableId="113213230">
+  <w:num w:numId="6" w16cid:durableId="1744377000">
     <w:abstractNumId w:val="1"/>
     <w:lvlOverride w:ilvl="0">
       <w:startOverride w:val="1"/>
     </w:lvlOverride>
   </w:num>
-  <w:num w:numId="6" w16cid:durableId="1174227024">
-    <w:abstractNumId w:val="0"/>
+  <w:num w:numId="7" w16cid:durableId="1303197978">
+    <w:abstractNumId w:val="2"/>
     <w:lvlOverride w:ilvl="0">
       <w:startOverride w:val="1"/>
     </w:lvlOverride>
   </w:num>
-  <w:num w:numId="7" w16cid:durableId="1668290559">
+  <w:num w:numId="8" w16cid:durableId="1523595093">
     <w:abstractNumId w:val="1"/>
     <w:lvlOverride w:ilvl="0">
       <w:startOverride w:val="1"/>
     </w:lvlOverride>
   </w:num>
-  <w:num w:numId="8" w16cid:durableId="1822849064">
-    <w:abstractNumId w:val="0"/>
+  <w:num w:numId="9" w16cid:durableId="1635482515">
+    <w:abstractNumId w:val="2"/>
     <w:lvlOverride w:ilvl="0">
       <w:startOverride w:val="1"/>
     </w:lvlOverride>
   </w:num>
-  <w:num w:numId="9" w16cid:durableId="363285539">
+  <w:num w:numId="10" w16cid:durableId="1385984494">
     <w:abstractNumId w:val="1"/>
     <w:lvlOverride w:ilvl="0">
       <w:startOverride w:val="1"/>
     </w:lvlOverride>
   </w:num>
-  <w:num w:numId="10" w16cid:durableId="1815759343">
-    <w:abstractNumId w:val="0"/>
+  <w:num w:numId="11" w16cid:durableId="1676613475">
+    <w:abstractNumId w:val="2"/>
     <w:lvlOverride w:ilvl="0">
       <w:startOverride w:val="1"/>
     </w:lvlOverride>
   </w:num>
-  <w:num w:numId="11" w16cid:durableId="797533162">
+  <w:num w:numId="12" w16cid:durableId="172653123">
     <w:abstractNumId w:val="1"/>
     <w:lvlOverride w:ilvl="0">
       <w:startOverride w:val="1"/>
     </w:lvlOverride>
   </w:num>
-  <w:num w:numId="12" w16cid:durableId="2137915817">
-    <w:abstractNumId w:val="0"/>
+  <w:num w:numId="13" w16cid:durableId="1261523490">
+    <w:abstractNumId w:val="2"/>
     <w:lvlOverride w:ilvl="0">
       <w:startOverride w:val="1"/>
     </w:lvlOverride>
   </w:num>
-  <w:num w:numId="13" w16cid:durableId="1492791175">
+  <w:num w:numId="14" w16cid:durableId="1003437658">
     <w:abstractNumId w:val="1"/>
     <w:lvlOverride w:ilvl="0">
       <w:startOverride w:val="1"/>
     </w:lvlOverride>
   </w:num>
-  <w:num w:numId="14" w16cid:durableId="1229684049">
-    <w:abstractNumId w:val="0"/>
+  <w:num w:numId="15" w16cid:durableId="394351652">
+    <w:abstractNumId w:val="2"/>
     <w:lvlOverride w:ilvl="0">
       <w:startOverride w:val="1"/>
     </w:lvlOverride>
   </w:num>
-  <w:num w:numId="15" w16cid:durableId="1814635839">
+  <w:num w:numId="16" w16cid:durableId="20129614">
     <w:abstractNumId w:val="1"/>
-    <w:lvlOverride w:ilvl="0">
-      <w:startOverride w:val="1"/>
-    </w:lvlOverride>
-  </w:num>
-  <w:num w:numId="16" w16cid:durableId="2106001027">
-    <w:abstractNumId w:val="0"/>
     <w:lvlOverride w:ilvl="0">
       <w:startOverride w:val="1"/>
     </w:lvlOverride>
@@ -19349,7 +19465,7 @@
     <w:autoRedefine/>
     <w:uiPriority w:val="39"/>
     <w:unhideWhenUsed/>
-    <w:rsid w:val="005A3732"/>
+    <w:rsid w:val="0072303C"/>
     <w:pPr>
       <w:spacing w:after="100"/>
     </w:pPr>
@@ -19361,7 +19477,7 @@
     <w:autoRedefine/>
     <w:uiPriority w:val="39"/>
     <w:unhideWhenUsed/>
-    <w:rsid w:val="005A3732"/>
+    <w:rsid w:val="0072303C"/>
     <w:pPr>
       <w:spacing w:after="100"/>
       <w:ind w:left="210"/>
@@ -19373,7 +19489,7 @@
     <w:next w:val="Normal"/>
     <w:uiPriority w:val="99"/>
     <w:unhideWhenUsed/>
-    <w:rsid w:val="005A3732"/>
+    <w:rsid w:val="0072303C"/>
   </w:style>
 </w:styles>
 </file>

</xml_diff>